<commit_message>
Add Phase 0 scaffold: README, ADRs, OpenAPI draft, P0 task cards, CLAUDE.md, design brief
</commit_message>
<xml_diff>
--- a/Cravio requirements.docx
+++ b/Cravio requirements.docx
@@ -12,6 +12,7 @@
           <w:sz w:val="80"/>
         </w:rPr>
       </w:pPr>
+      <w:proofErr w:type="spellStart"/>
       <w:r>
         <w:rPr>
           <w:rFonts w:ascii="Calibri" w:hAnsi="Calibri" w:cs="Calibri"/>
@@ -21,6 +22,7 @@
         </w:rPr>
         <w:t>Cravio</w:t>
       </w:r>
+      <w:proofErr w:type="spellEnd"/>
     </w:p>
     <w:p>
       <w:pPr>
@@ -152,6 +154,38 @@
           <w:szCs w:val="24"/>
         </w:rPr>
         <w:t xml:space="preserve"> A commission-free, verified, AI-augmented influencer marketplace that is influencer-first in philosophy but brand-performance-first in outcomes.</w:t>
+      </w:r>
+      <w:r>
+        <w:rPr>
+          <w:rFonts w:ascii="Calibri" w:hAnsi="Calibri" w:cs="Calibri"/>
+          <w:sz w:val="24"/>
+          <w:szCs w:val="24"/>
+        </w:rPr>
+        <w:t xml:space="preserve"> Differentiation priorities, in sequence, are AI-first, then regional-language, then YouTube/cross-platform verification, then community.</w:t>
+      </w:r>
+    </w:p>
+    <w:p>
+      <w:pPr>
+        <w:pStyle w:val="Heading1"/>
+      </w:pPr>
+      <w:r>
+        <w:t>Scope &amp; Constraints</w:t>
+      </w:r>
+    </w:p>
+    <w:p>
+      <w:pPr>
+        <w:pStyle w:val="ListBullet"/>
+      </w:pPr>
+      <w:r>
+        <w:t>Geography: India-wide from Day 1 (not a single-city launch).</w:t>
+      </w:r>
+    </w:p>
+    <w:p>
+      <w:pPr>
+        <w:pStyle w:val="ListBullet"/>
+      </w:pPr>
+      <w:r>
+        <w:t>Funding: Bootstrapped - Phase 1 scope kept lean accordingly (no capital-intensive bets pre-revenue).</w:t>
       </w:r>
     </w:p>
     <w:p>
@@ -892,6 +926,7 @@
           <w:sz w:val="24"/>
           <w:szCs w:val="24"/>
         </w:rPr>
+        <w:lastRenderedPageBreak/>
         <w:t>No centralized platform to track campaign status, deliverables, and performance metrics</w:t>
       </w:r>
     </w:p>
@@ -1034,7 +1069,6 @@
           <w:sz w:val="24"/>
           <w:szCs w:val="24"/>
         </w:rPr>
-        <w:lastRenderedPageBreak/>
         <w:t>Agencies and middlemen take cuts, reducing net earnings</w:t>
       </w:r>
     </w:p>
@@ -2622,6 +2656,7 @@
           <w:sz w:val="28"/>
           <w:szCs w:val="28"/>
         </w:rPr>
+        <w:lastRenderedPageBreak/>
         <w:t>Persona: The Established Influencer</w:t>
       </w:r>
     </w:p>
@@ -2938,7 +2973,6 @@
                 <w:sz w:val="24"/>
                 <w:szCs w:val="24"/>
               </w:rPr>
-              <w:lastRenderedPageBreak/>
               <w:t>Key Need</w:t>
             </w:r>
           </w:p>
@@ -4944,6 +4978,7 @@
           <w:sz w:val="28"/>
           <w:szCs w:val="28"/>
         </w:rPr>
+        <w:lastRenderedPageBreak/>
         <w:t>Influencer Discovery (Brand</w:t>
       </w:r>
       <w:r>
@@ -5240,7 +5275,6 @@
                 <w:sz w:val="24"/>
                 <w:szCs w:val="24"/>
               </w:rPr>
-              <w:lastRenderedPageBreak/>
               <w:t>AI</w:t>
             </w:r>
             <w:r>
@@ -7485,6 +7519,7 @@
                 <w:sz w:val="24"/>
                 <w:szCs w:val="24"/>
               </w:rPr>
+              <w:lastRenderedPageBreak/>
               <w:t>Feature</w:t>
             </w:r>
           </w:p>
@@ -7844,7 +7879,6 @@
                 <w:sz w:val="24"/>
                 <w:szCs w:val="24"/>
               </w:rPr>
-              <w:lastRenderedPageBreak/>
               <w:t>Application Tracker</w:t>
             </w:r>
           </w:p>
@@ -10165,6 +10199,7 @@
                 <w:sz w:val="24"/>
                 <w:szCs w:val="24"/>
               </w:rPr>
+              <w:lastRenderedPageBreak/>
               <w:t>Knowledge Hub / Blog</w:t>
             </w:r>
           </w:p>
@@ -10379,7 +10414,6 @@
                 <w:sz w:val="24"/>
                 <w:szCs w:val="24"/>
               </w:rPr>
-              <w:lastRenderedPageBreak/>
               <w:t>Insta Awards / Gamification</w:t>
             </w:r>
           </w:p>
@@ -11739,8 +11773,18 @@
                 <w:sz w:val="24"/>
                 <w:szCs w:val="24"/>
               </w:rPr>
-              <w:t>12 + FastAPI</w:t>
-            </w:r>
+              <w:t xml:space="preserve">12 + </w:t>
+            </w:r>
+            <w:proofErr w:type="spellStart"/>
+            <w:r>
+              <w:rPr>
+                <w:rFonts w:ascii="Calibri" w:hAnsi="Calibri" w:cs="Calibri"/>
+                <w:sz w:val="24"/>
+                <w:szCs w:val="24"/>
+              </w:rPr>
+              <w:t>FastAPI</w:t>
+            </w:r>
+            <w:proofErr w:type="spellEnd"/>
           </w:p>
         </w:tc>
         <w:tc>
@@ -12185,13 +12229,23 @@
                 <w:szCs w:val="24"/>
               </w:rPr>
             </w:pPr>
-            <w:r>
-              <w:rPr>
-                <w:rFonts w:ascii="Calibri" w:hAnsi="Calibri" w:cs="Calibri"/>
-                <w:sz w:val="24"/>
-                <w:szCs w:val="24"/>
-              </w:rPr>
-              <w:t xml:space="preserve">Razorpay </w:t>
+            <w:proofErr w:type="spellStart"/>
+            <w:r>
+              <w:rPr>
+                <w:rFonts w:ascii="Calibri" w:hAnsi="Calibri" w:cs="Calibri"/>
+                <w:sz w:val="24"/>
+                <w:szCs w:val="24"/>
+              </w:rPr>
+              <w:t>Razorpay</w:t>
+            </w:r>
+            <w:proofErr w:type="spellEnd"/>
+            <w:r>
+              <w:rPr>
+                <w:rFonts w:ascii="Calibri" w:hAnsi="Calibri" w:cs="Calibri"/>
+                <w:sz w:val="24"/>
+                <w:szCs w:val="24"/>
+              </w:rPr>
+              <w:t xml:space="preserve"> </w:t>
             </w:r>
             <w:r>
               <w:rPr>
@@ -12394,6 +12448,7 @@
                 <w:sz w:val="24"/>
                 <w:szCs w:val="24"/>
               </w:rPr>
+              <w:lastRenderedPageBreak/>
               <w:t>Social API</w:t>
             </w:r>
           </w:p>
@@ -12552,7 +12607,43 @@
                 <w:sz w:val="24"/>
                 <w:szCs w:val="24"/>
               </w:rPr>
-              <w:t>PostgreSQL full-text + trigram (MVP); Algolia at scale</w:t>
+              <w:t xml:space="preserve">PostgreSQL </w:t>
+            </w:r>
+            <w:proofErr w:type="gramStart"/>
+            <w:r>
+              <w:rPr>
+                <w:rFonts w:ascii="Calibri" w:hAnsi="Calibri" w:cs="Calibri"/>
+                <w:sz w:val="24"/>
+                <w:szCs w:val="24"/>
+              </w:rPr>
+              <w:t>full-text</w:t>
+            </w:r>
+            <w:proofErr w:type="gramEnd"/>
+            <w:r>
+              <w:rPr>
+                <w:rFonts w:ascii="Calibri" w:hAnsi="Calibri" w:cs="Calibri"/>
+                <w:sz w:val="24"/>
+                <w:szCs w:val="24"/>
+              </w:rPr>
+              <w:t xml:space="preserve"> + trigram (MVP); </w:t>
+            </w:r>
+            <w:proofErr w:type="spellStart"/>
+            <w:r>
+              <w:rPr>
+                <w:rFonts w:ascii="Calibri" w:hAnsi="Calibri" w:cs="Calibri"/>
+                <w:sz w:val="24"/>
+                <w:szCs w:val="24"/>
+              </w:rPr>
+              <w:t>Algolia</w:t>
+            </w:r>
+            <w:proofErr w:type="spellEnd"/>
+            <w:r>
+              <w:rPr>
+                <w:rFonts w:ascii="Calibri" w:hAnsi="Calibri" w:cs="Calibri"/>
+                <w:sz w:val="24"/>
+                <w:szCs w:val="24"/>
+              </w:rPr>
+              <w:t xml:space="preserve"> at scale</w:t>
             </w:r>
           </w:p>
         </w:tc>
@@ -12624,7 +12715,6 @@
                 <w:sz w:val="24"/>
                 <w:szCs w:val="24"/>
               </w:rPr>
-              <w:lastRenderedPageBreak/>
               <w:t>Push Notifications</w:t>
             </w:r>
           </w:p>
@@ -12761,13 +12851,23 @@
                 <w:szCs w:val="24"/>
               </w:rPr>
             </w:pPr>
-            <w:r>
-              <w:rPr>
-                <w:rFonts w:ascii="Calibri" w:hAnsi="Calibri" w:cs="Calibri"/>
-                <w:sz w:val="24"/>
-                <w:szCs w:val="24"/>
-              </w:rPr>
-              <w:t>PostHog (self-serve, generous free tier)</w:t>
+            <w:proofErr w:type="spellStart"/>
+            <w:r>
+              <w:rPr>
+                <w:rFonts w:ascii="Calibri" w:hAnsi="Calibri" w:cs="Calibri"/>
+                <w:sz w:val="24"/>
+                <w:szCs w:val="24"/>
+              </w:rPr>
+              <w:t>PostHog</w:t>
+            </w:r>
+            <w:proofErr w:type="spellEnd"/>
+            <w:r>
+              <w:rPr>
+                <w:rFonts w:ascii="Calibri" w:hAnsi="Calibri" w:cs="Calibri"/>
+                <w:sz w:val="24"/>
+                <w:szCs w:val="24"/>
+              </w:rPr>
+              <w:t xml:space="preserve"> (self-serve, generous free tier)</w:t>
             </w:r>
           </w:p>
         </w:tc>
@@ -12917,7 +13017,25 @@
           <w:sz w:val="24"/>
           <w:szCs w:val="24"/>
         </w:rPr>
-        <w:t xml:space="preserve"> Razorpay </w:t>
+        <w:t xml:space="preserve"> </w:t>
+      </w:r>
+      <w:proofErr w:type="spellStart"/>
+      <w:r>
+        <w:rPr>
+          <w:rFonts w:ascii="Calibri" w:hAnsi="Calibri" w:cs="Calibri"/>
+          <w:sz w:val="24"/>
+          <w:szCs w:val="24"/>
+        </w:rPr>
+        <w:t>Razorpay</w:t>
+      </w:r>
+      <w:proofErr w:type="spellEnd"/>
+      <w:r>
+        <w:rPr>
+          <w:rFonts w:ascii="Calibri" w:hAnsi="Calibri" w:cs="Calibri"/>
+          <w:sz w:val="24"/>
+          <w:szCs w:val="24"/>
+        </w:rPr>
+        <w:t xml:space="preserve"> </w:t>
       </w:r>
       <w:r>
         <w:rPr>
@@ -13034,23 +13152,7 @@
           <w:sz w:val="24"/>
           <w:szCs w:val="24"/>
         </w:rPr>
-        <w:t xml:space="preserve">[DIFFERENTIATOR?] YouTube Data API </w:t>
-      </w:r>
-      <w:r>
-        <w:rPr>
-          <w:rFonts w:ascii="Calibri" w:hAnsi="Calibri" w:cs="Calibri"/>
-          <w:sz w:val="24"/>
-          <w:szCs w:val="24"/>
-        </w:rPr>
-        <w:t>-</w:t>
-      </w:r>
-      <w:r>
-        <w:rPr>
-          <w:rFonts w:ascii="Calibri" w:hAnsi="Calibri" w:cs="Calibri"/>
-          <w:sz w:val="24"/>
-          <w:szCs w:val="24"/>
-        </w:rPr>
-        <w:t xml:space="preserve"> extend verification beyond Instagram to YouTube</w:t>
+        <w:t>YouTube Data API - extend verification to YouTube (Phase 1, alongside Instagram)</w:t>
       </w:r>
     </w:p>
     <w:p>
@@ -13071,7 +13173,21 @@
         <w:rPr>
           <w:rFonts w:ascii="Calibri" w:hAnsi="Calibri" w:cs="Calibri"/>
         </w:rPr>
-        <w:t>This product is built solo with AI agents. Claude Code handles implementation (code, tests, infra-as-code); Cowork handles operations, content, research, and coordination. This section gives both the conventions they need to work from this PRD directly. Treat the committed stack in Core Backend Services as authoritative.</w:t>
+        <w:t xml:space="preserve">This product is built solo with AI agents. Claude Code handles implementation (code, tests, infra-as-code); </w:t>
+      </w:r>
+      <w:proofErr w:type="spellStart"/>
+      <w:r>
+        <w:rPr>
+          <w:rFonts w:ascii="Calibri" w:hAnsi="Calibri" w:cs="Calibri"/>
+        </w:rPr>
+        <w:t>Cowork</w:t>
+      </w:r>
+      <w:proofErr w:type="spellEnd"/>
+      <w:r>
+        <w:rPr>
+          <w:rFonts w:ascii="Calibri" w:hAnsi="Calibri" w:cs="Calibri"/>
+        </w:rPr>
+        <w:t xml:space="preserve"> handles operations, content, research, and coordination. This section gives both the conventions they need to work from this PRD directly. Treat the committed stack in Core Backend Services as authoritative.</w:t>
       </w:r>
     </w:p>
     <w:p>
@@ -13093,7 +13209,35 @@
         <w:rPr>
           <w:rFonts w:ascii="Calibri" w:hAnsi="Calibri" w:cs="Calibri"/>
         </w:rPr>
-        <w:t>Claude Code - repo scaffolding, FastAPI services, database schema/migrations, mobile app (React Native), Razorpay/Meta/Firebase integrations, tests, CI/CD, infra-as-code.</w:t>
+        <w:t xml:space="preserve">Claude Code - repo scaffolding, </w:t>
+      </w:r>
+      <w:proofErr w:type="spellStart"/>
+      <w:r>
+        <w:rPr>
+          <w:rFonts w:ascii="Calibri" w:hAnsi="Calibri" w:cs="Calibri"/>
+        </w:rPr>
+        <w:t>FastAPI</w:t>
+      </w:r>
+      <w:proofErr w:type="spellEnd"/>
+      <w:r>
+        <w:rPr>
+          <w:rFonts w:ascii="Calibri" w:hAnsi="Calibri" w:cs="Calibri"/>
+        </w:rPr>
+        <w:t xml:space="preserve"> services, database schema/migrations, mobile app (React Native), </w:t>
+      </w:r>
+      <w:proofErr w:type="spellStart"/>
+      <w:r>
+        <w:rPr>
+          <w:rFonts w:ascii="Calibri" w:hAnsi="Calibri" w:cs="Calibri"/>
+        </w:rPr>
+        <w:t>Razorpay</w:t>
+      </w:r>
+      <w:proofErr w:type="spellEnd"/>
+      <w:r>
+        <w:rPr>
+          <w:rFonts w:ascii="Calibri" w:hAnsi="Calibri" w:cs="Calibri"/>
+        </w:rPr>
+        <w:t>/Meta/Firebase integrations, tests, CI/CD, infra-as-code.</w:t>
       </w:r>
     </w:p>
     <w:p>
@@ -13103,11 +13247,19 @@
           <w:rFonts w:ascii="Calibri" w:hAnsi="Calibri" w:cs="Calibri"/>
         </w:rPr>
       </w:pPr>
-      <w:r>
-        <w:rPr>
-          <w:rFonts w:ascii="Calibri" w:hAnsi="Calibri" w:cs="Calibri"/>
-        </w:rPr>
-        <w:t>Cowork - market validation interviews, waitlist landing copy, Knowledge Hub / blog content, App Store listing assets, competitor monitoring, founder ops (vendor onboarding, support triage), and turning roadmap items into scoped agent tasks.</w:t>
+      <w:proofErr w:type="spellStart"/>
+      <w:r>
+        <w:rPr>
+          <w:rFonts w:ascii="Calibri" w:hAnsi="Calibri" w:cs="Calibri"/>
+        </w:rPr>
+        <w:t>Cowork</w:t>
+      </w:r>
+      <w:proofErr w:type="spellEnd"/>
+      <w:r>
+        <w:rPr>
+          <w:rFonts w:ascii="Calibri" w:hAnsi="Calibri" w:cs="Calibri"/>
+        </w:rPr>
+        <w:t xml:space="preserve"> - market validation interviews, waitlist landing copy, Knowledge Hub / blog content, App Store listing assets, competitor monitoring, founder ops (vendor onboarding, support triage), and turning roadmap items into scoped agent tasks.</w:t>
       </w:r>
     </w:p>
     <w:p>
@@ -13139,11 +13291,61 @@
           <w:rFonts w:ascii="Calibri" w:hAnsi="Calibri" w:cs="Calibri"/>
         </w:rPr>
       </w:pPr>
-      <w:r>
-        <w:rPr>
-          <w:rFonts w:ascii="Calibri" w:hAnsi="Calibri" w:cs="Calibri"/>
-        </w:rPr>
-        <w:t>Monorepo: /api (FastAPI backend), /mobile (React Native app), /admin (internal web dashboard), /infra (IaC), /docs (this PRD + ADRs).</w:t>
+      <w:proofErr w:type="spellStart"/>
+      <w:r>
+        <w:rPr>
+          <w:rFonts w:ascii="Calibri" w:hAnsi="Calibri" w:cs="Calibri"/>
+        </w:rPr>
+        <w:t>Monorepo</w:t>
+      </w:r>
+      <w:proofErr w:type="spellEnd"/>
+      <w:r>
+        <w:rPr>
+          <w:rFonts w:ascii="Calibri" w:hAnsi="Calibri" w:cs="Calibri"/>
+        </w:rPr>
+        <w:t>: /</w:t>
+      </w:r>
+      <w:proofErr w:type="spellStart"/>
+      <w:r>
+        <w:rPr>
+          <w:rFonts w:ascii="Calibri" w:hAnsi="Calibri" w:cs="Calibri"/>
+        </w:rPr>
+        <w:t>api</w:t>
+      </w:r>
+      <w:proofErr w:type="spellEnd"/>
+      <w:r>
+        <w:rPr>
+          <w:rFonts w:ascii="Calibri" w:hAnsi="Calibri" w:cs="Calibri"/>
+        </w:rPr>
+        <w:t xml:space="preserve"> (</w:t>
+      </w:r>
+      <w:proofErr w:type="spellStart"/>
+      <w:r>
+        <w:rPr>
+          <w:rFonts w:ascii="Calibri" w:hAnsi="Calibri" w:cs="Calibri"/>
+        </w:rPr>
+        <w:t>FastAPI</w:t>
+      </w:r>
+      <w:proofErr w:type="spellEnd"/>
+      <w:r>
+        <w:rPr>
+          <w:rFonts w:ascii="Calibri" w:hAnsi="Calibri" w:cs="Calibri"/>
+        </w:rPr>
+        <w:t xml:space="preserve"> backend), /mobile (React Native app), /admin (internal web dashboard), /infra (</w:t>
+      </w:r>
+      <w:proofErr w:type="spellStart"/>
+      <w:r>
+        <w:rPr>
+          <w:rFonts w:ascii="Calibri" w:hAnsi="Calibri" w:cs="Calibri"/>
+        </w:rPr>
+        <w:t>IaC</w:t>
+      </w:r>
+      <w:proofErr w:type="spellEnd"/>
+      <w:r>
+        <w:rPr>
+          <w:rFonts w:ascii="Calibri" w:hAnsi="Calibri" w:cs="Calibri"/>
+        </w:rPr>
+        <w:t>), /docs (this PRD + ADRs).</w:t>
       </w:r>
     </w:p>
     <w:p>
@@ -13171,7 +13373,21 @@
         <w:rPr>
           <w:rFonts w:ascii="Calibri" w:hAnsi="Calibri" w:cs="Calibri"/>
         </w:rPr>
-        <w:t>Architecture Decision Records (ADRs) live in /docs/adr; every committed-stack choice in this PRD gets a one-page ADR so agents know the rationale, not just the choice.</w:t>
+        <w:t>Architecture Decision Records (ADRs) live in /docs/</w:t>
+      </w:r>
+      <w:proofErr w:type="spellStart"/>
+      <w:r>
+        <w:rPr>
+          <w:rFonts w:ascii="Calibri" w:hAnsi="Calibri" w:cs="Calibri"/>
+        </w:rPr>
+        <w:t>adr</w:t>
+      </w:r>
+      <w:proofErr w:type="spellEnd"/>
+      <w:r>
+        <w:rPr>
+          <w:rFonts w:ascii="Calibri" w:hAnsi="Calibri" w:cs="Calibri"/>
+        </w:rPr>
+        <w:t>; every committed-stack choice in this PRD gets a one-page ADR so agents know the rationale, not just the choice.</w:t>
       </w:r>
     </w:p>
     <w:p>
@@ -13207,6 +13423,7 @@
         <w:rPr>
           <w:rFonts w:ascii="Calibri" w:hAnsi="Calibri" w:cs="Calibri"/>
         </w:rPr>
+        <w:lastRenderedPageBreak/>
         <w:t>Each task names its acceptance criteria as testable assertions; Claude Code writes tests first, then implementation.</w:t>
       </w:r>
     </w:p>
@@ -13235,7 +13452,21 @@
         <w:rPr>
           <w:rFonts w:ascii="Calibri" w:hAnsi="Calibri" w:cs="Calibri"/>
         </w:rPr>
-        <w:t>External integrations (Meta API, Razorpay, Firebase) are stubbed behind interfaces first so features can be built and tested before live credentials exist.</w:t>
+        <w:t xml:space="preserve">External integrations (Meta API, </w:t>
+      </w:r>
+      <w:proofErr w:type="spellStart"/>
+      <w:r>
+        <w:rPr>
+          <w:rFonts w:ascii="Calibri" w:hAnsi="Calibri" w:cs="Calibri"/>
+        </w:rPr>
+        <w:t>Razorpay</w:t>
+      </w:r>
+      <w:proofErr w:type="spellEnd"/>
+      <w:r>
+        <w:rPr>
+          <w:rFonts w:ascii="Calibri" w:hAnsi="Calibri" w:cs="Calibri"/>
+        </w:rPr>
+        <w:t>, Firebase) are stubbed behind interfaces first so features can be built and tested before live credentials exist.</w:t>
       </w:r>
     </w:p>
     <w:p>
@@ -13243,7 +13474,6 @@
         <w:pStyle w:val="Heading2"/>
       </w:pPr>
       <w:r>
-        <w:lastRenderedPageBreak/>
         <w:t>Build Conventions</w:t>
       </w:r>
     </w:p>
@@ -13258,7 +13488,21 @@
         <w:rPr>
           <w:rFonts w:ascii="Calibri" w:hAnsi="Calibri" w:cs="Calibri"/>
         </w:rPr>
-        <w:t>API: REST + WebSocket, OpenAPI spec auto-generated and committed so agents and the mobile app share one contract.</w:t>
+        <w:t xml:space="preserve">API: REST + WebSocket, </w:t>
+      </w:r>
+      <w:proofErr w:type="spellStart"/>
+      <w:r>
+        <w:rPr>
+          <w:rFonts w:ascii="Calibri" w:hAnsi="Calibri" w:cs="Calibri"/>
+        </w:rPr>
+        <w:t>OpenAPI</w:t>
+      </w:r>
+      <w:proofErr w:type="spellEnd"/>
+      <w:r>
+        <w:rPr>
+          <w:rFonts w:ascii="Calibri" w:hAnsi="Calibri" w:cs="Calibri"/>
+        </w:rPr>
+        <w:t xml:space="preserve"> spec auto-generated and committed so agents and the mobile app share one contract.</w:t>
       </w:r>
     </w:p>
     <w:p>
@@ -14677,6 +14921,7 @@
                 <w:sz w:val="24"/>
                 <w:szCs w:val="24"/>
               </w:rPr>
+              <w:lastRenderedPageBreak/>
               <w:t>Verification</w:t>
             </w:r>
           </w:p>
@@ -14747,15 +14992,31 @@
                 <w:sz w:val="24"/>
                 <w:szCs w:val="24"/>
               </w:rPr>
-              <w:t xml:space="preserve">[DIFFERENTIATOR?] Add YouTube </w:t>
-            </w:r>
-            <w:r>
-              <w:rPr>
-                <w:rFonts w:ascii="Calibri" w:hAnsi="Calibri" w:cs="Calibri"/>
-                <w:sz w:val="24"/>
-                <w:szCs w:val="24"/>
-              </w:rPr>
-              <w:t>(Phase 3); LinkedIn deferred</w:t>
+              <w:t xml:space="preserve">Add YouTube </w:t>
+            </w:r>
+            <w:r>
+              <w:rPr>
+                <w:rFonts w:ascii="Calibri" w:hAnsi="Calibri" w:cs="Calibri"/>
+                <w:sz w:val="24"/>
+                <w:szCs w:val="24"/>
+              </w:rPr>
+              <w:t xml:space="preserve">(Phase </w:t>
+            </w:r>
+            <w:r>
+              <w:rPr>
+                <w:rFonts w:ascii="Calibri" w:hAnsi="Calibri" w:cs="Calibri"/>
+                <w:sz w:val="24"/>
+                <w:szCs w:val="24"/>
+              </w:rPr>
+              <w:t>1</w:t>
+            </w:r>
+            <w:r>
+              <w:rPr>
+                <w:rFonts w:ascii="Calibri" w:hAnsi="Calibri" w:cs="Calibri"/>
+                <w:sz w:val="24"/>
+                <w:szCs w:val="24"/>
+              </w:rPr>
+              <w:t>); LinkedIn deferred</w:t>
             </w:r>
           </w:p>
         </w:tc>
@@ -14899,7 +15160,6 @@
                 <w:sz w:val="24"/>
                 <w:szCs w:val="24"/>
               </w:rPr>
-              <w:lastRenderedPageBreak/>
               <w:t>AI Tools</w:t>
             </w:r>
           </w:p>
@@ -14970,7 +15230,7 @@
                 <w:sz w:val="24"/>
                 <w:szCs w:val="24"/>
               </w:rPr>
-              <w:t>[DIFFERENTIATOR?] Richer AI: SEO hashtag AI, thumbnail gen</w:t>
+              <w:t>Richer AI: SEO hashtag AI, thumbnail gen</w:t>
             </w:r>
           </w:p>
         </w:tc>
@@ -15232,7 +15492,31 @@
                 <w:sz w:val="24"/>
                 <w:szCs w:val="24"/>
               </w:rPr>
-              <w:t>[DIFFERENTIATOR?] Launch web dashboard for brands simultaneously</w:t>
+              <w:t xml:space="preserve">Launch </w:t>
+            </w:r>
+            <w:r>
+              <w:rPr>
+                <w:rFonts w:ascii="Calibri" w:hAnsi="Calibri" w:cs="Calibri"/>
+                <w:sz w:val="24"/>
+                <w:szCs w:val="24"/>
+              </w:rPr>
+              <w:t xml:space="preserve">brand </w:t>
+            </w:r>
+            <w:r>
+              <w:rPr>
+                <w:rFonts w:ascii="Calibri" w:hAnsi="Calibri" w:cs="Calibri"/>
+                <w:sz w:val="24"/>
+                <w:szCs w:val="24"/>
+              </w:rPr>
+              <w:t xml:space="preserve">web dashboard </w:t>
+            </w:r>
+            <w:r>
+              <w:rPr>
+                <w:rFonts w:ascii="Calibri" w:hAnsi="Calibri" w:cs="Calibri"/>
+                <w:sz w:val="24"/>
+                <w:szCs w:val="24"/>
+              </w:rPr>
+              <w:t>- app prioritized, web follows</w:t>
             </w:r>
           </w:p>
         </w:tc>
@@ -15446,7 +15730,7 @@
                 <w:sz w:val="24"/>
                 <w:szCs w:val="24"/>
               </w:rPr>
-              <w:t>[DIFFERENTIATOR?] Add affiliate/performance</w:t>
+              <w:t>Add affiliate/performance</w:t>
             </w:r>
             <w:r>
               <w:rPr>
@@ -15569,7 +15853,7 @@
                 <w:sz w:val="24"/>
                 <w:szCs w:val="24"/>
               </w:rPr>
-              <w:t>[DIFFERENTIATOR?] In</w:t>
+              <w:t>In</w:t>
             </w:r>
             <w:r>
               <w:rPr>
@@ -15825,6 +16109,7 @@
           <w:rFonts w:ascii="Calibri" w:hAnsi="Calibri" w:cs="Calibri"/>
           <w:color w:val="auto"/>
         </w:rPr>
+        <w:lastRenderedPageBreak/>
         <w:t>Non</w:t>
       </w:r>
       <w:r>
@@ -15973,7 +16258,6 @@
                 <w:sz w:val="24"/>
                 <w:szCs w:val="24"/>
               </w:rPr>
-              <w:lastRenderedPageBreak/>
               <w:t>App Load Time</w:t>
             </w:r>
           </w:p>
@@ -16786,7 +17070,61 @@
           <w:sz w:val="24"/>
           <w:szCs w:val="24"/>
         </w:rPr>
-        <w:t>Stand up monorepo (/api, /mobile, /admin, /infra, /docs) with per-package CLAUDE.md, CI (lint + tests), and committed OpenAPI contract</w:t>
+        <w:t xml:space="preserve">Stand up </w:t>
+      </w:r>
+      <w:proofErr w:type="spellStart"/>
+      <w:r>
+        <w:rPr>
+          <w:rFonts w:ascii="Calibri" w:hAnsi="Calibri" w:cs="Calibri"/>
+          <w:sz w:val="24"/>
+          <w:szCs w:val="24"/>
+        </w:rPr>
+        <w:t>monorepo</w:t>
+      </w:r>
+      <w:proofErr w:type="spellEnd"/>
+      <w:r>
+        <w:rPr>
+          <w:rFonts w:ascii="Calibri" w:hAnsi="Calibri" w:cs="Calibri"/>
+          <w:sz w:val="24"/>
+          <w:szCs w:val="24"/>
+        </w:rPr>
+        <w:t xml:space="preserve"> (/</w:t>
+      </w:r>
+      <w:proofErr w:type="spellStart"/>
+      <w:r>
+        <w:rPr>
+          <w:rFonts w:ascii="Calibri" w:hAnsi="Calibri" w:cs="Calibri"/>
+          <w:sz w:val="24"/>
+          <w:szCs w:val="24"/>
+        </w:rPr>
+        <w:t>api</w:t>
+      </w:r>
+      <w:proofErr w:type="spellEnd"/>
+      <w:r>
+        <w:rPr>
+          <w:rFonts w:ascii="Calibri" w:hAnsi="Calibri" w:cs="Calibri"/>
+          <w:sz w:val="24"/>
+          <w:szCs w:val="24"/>
+        </w:rPr>
+        <w:t xml:space="preserve">, /mobile, /admin, /infra, /docs) with per-package CLAUDE.md, CI (lint + tests), and committed </w:t>
+      </w:r>
+      <w:proofErr w:type="spellStart"/>
+      <w:r>
+        <w:rPr>
+          <w:rFonts w:ascii="Calibri" w:hAnsi="Calibri" w:cs="Calibri"/>
+          <w:sz w:val="24"/>
+          <w:szCs w:val="24"/>
+        </w:rPr>
+        <w:t>OpenAPI</w:t>
+      </w:r>
+      <w:proofErr w:type="spellEnd"/>
+      <w:r>
+        <w:rPr>
+          <w:rFonts w:ascii="Calibri" w:hAnsi="Calibri" w:cs="Calibri"/>
+          <w:sz w:val="24"/>
+          <w:szCs w:val="24"/>
+        </w:rPr>
+        <w:t xml:space="preserve"> contract</w:t>
       </w:r>
     </w:p>
     <w:p>
@@ -16832,7 +17170,25 @@
           <w:sz w:val="24"/>
           <w:szCs w:val="24"/>
         </w:rPr>
-        <w:t>Stub Meta API, Razorpay, and Firebase behind interfaces so P0 features can be built and tested before live credentials</w:t>
+        <w:t xml:space="preserve">Stub Meta API, </w:t>
+      </w:r>
+      <w:proofErr w:type="spellStart"/>
+      <w:r>
+        <w:rPr>
+          <w:rFonts w:ascii="Calibri" w:hAnsi="Calibri" w:cs="Calibri"/>
+          <w:sz w:val="24"/>
+          <w:szCs w:val="24"/>
+        </w:rPr>
+        <w:t>Razorpay</w:t>
+      </w:r>
+      <w:proofErr w:type="spellEnd"/>
+      <w:r>
+        <w:rPr>
+          <w:rFonts w:ascii="Calibri" w:hAnsi="Calibri" w:cs="Calibri"/>
+          <w:sz w:val="24"/>
+          <w:szCs w:val="24"/>
+        </w:rPr>
+        <w:t>, and Firebase behind interfaces so P0 features can be built and tested before live credentials</w:t>
       </w:r>
     </w:p>
     <w:p>
@@ -16967,7 +17323,23 @@
           <w:sz w:val="24"/>
           <w:szCs w:val="24"/>
         </w:rPr>
-        <w:t>Influencer onboarding with Meta API verification</w:t>
+        <w:t xml:space="preserve">Influencer onboarding with Meta API </w:t>
+      </w:r>
+      <w:r>
+        <w:rPr>
+          <w:rFonts w:ascii="Calibri" w:hAnsi="Calibri" w:cs="Calibri"/>
+          <w:sz w:val="24"/>
+          <w:szCs w:val="24"/>
+        </w:rPr>
+        <w:t xml:space="preserve">(Instagram) + YouTube Data API </w:t>
+      </w:r>
+      <w:r>
+        <w:rPr>
+          <w:rFonts w:ascii="Calibri" w:hAnsi="Calibri" w:cs="Calibri"/>
+          <w:sz w:val="24"/>
+          <w:szCs w:val="24"/>
+        </w:rPr>
+        <w:t>verification</w:t>
       </w:r>
     </w:p>
     <w:p>
@@ -17178,6 +17550,7 @@
           <w:sz w:val="28"/>
           <w:szCs w:val="28"/>
         </w:rPr>
+        <w:lastRenderedPageBreak/>
         <w:t>Phase 2: Core Platform (</w:t>
       </w:r>
       <w:r>
@@ -17240,7 +17613,6 @@
           <w:sz w:val="24"/>
           <w:szCs w:val="24"/>
         </w:rPr>
-        <w:lastRenderedPageBreak/>
         <w:t>OTP</w:t>
       </w:r>
       <w:r>
@@ -17601,23 +17973,7 @@
           <w:sz w:val="24"/>
           <w:szCs w:val="24"/>
         </w:rPr>
-        <w:t>YouTube API integration for cross</w:t>
-      </w:r>
-      <w:r>
-        <w:rPr>
-          <w:rFonts w:ascii="Calibri" w:hAnsi="Calibri" w:cs="Calibri"/>
-          <w:sz w:val="24"/>
-          <w:szCs w:val="24"/>
-        </w:rPr>
-        <w:t>-</w:t>
-      </w:r>
-      <w:r>
-        <w:rPr>
-          <w:rFonts w:ascii="Calibri" w:hAnsi="Calibri" w:cs="Calibri"/>
-          <w:sz w:val="24"/>
-          <w:szCs w:val="24"/>
-        </w:rPr>
-        <w:t>platform verification</w:t>
+        <w:t>AI Trend Analyzer - real-time viral content alerts</w:t>
       </w:r>
     </w:p>
     <w:p>
@@ -17640,39 +17996,7 @@
           <w:sz w:val="24"/>
           <w:szCs w:val="24"/>
         </w:rPr>
-        <w:t xml:space="preserve">AI Trend Analyzer </w:t>
-      </w:r>
-      <w:r>
-        <w:rPr>
-          <w:rFonts w:ascii="Calibri" w:hAnsi="Calibri" w:cs="Calibri"/>
-          <w:sz w:val="24"/>
-          <w:szCs w:val="24"/>
-        </w:rPr>
-        <w:t>-</w:t>
-      </w:r>
-      <w:r>
-        <w:rPr>
-          <w:rFonts w:ascii="Calibri" w:hAnsi="Calibri" w:cs="Calibri"/>
-          <w:sz w:val="24"/>
-          <w:szCs w:val="24"/>
-        </w:rPr>
-        <w:t xml:space="preserve"> real</w:t>
-      </w:r>
-      <w:r>
-        <w:rPr>
-          <w:rFonts w:ascii="Calibri" w:hAnsi="Calibri" w:cs="Calibri"/>
-          <w:sz w:val="24"/>
-          <w:szCs w:val="24"/>
-        </w:rPr>
-        <w:t>-</w:t>
-      </w:r>
-      <w:r>
-        <w:rPr>
-          <w:rFonts w:ascii="Calibri" w:hAnsi="Calibri" w:cs="Calibri"/>
-          <w:sz w:val="24"/>
-          <w:szCs w:val="24"/>
-        </w:rPr>
-        <w:t>time viral content alerts</w:t>
+        <w:t>Regional language UI (Hindi, Tamil, Telugu, Bengali)</w:t>
       </w:r>
     </w:p>
     <w:p>
@@ -17695,7 +18019,23 @@
           <w:sz w:val="24"/>
           <w:szCs w:val="24"/>
         </w:rPr>
-        <w:t>Regional language UI (Hindi, Tamil, Telugu, Bengali)</w:t>
+        <w:t>Performance</w:t>
+      </w:r>
+      <w:r>
+        <w:rPr>
+          <w:rFonts w:ascii="Calibri" w:hAnsi="Calibri" w:cs="Calibri"/>
+          <w:sz w:val="24"/>
+          <w:szCs w:val="24"/>
+        </w:rPr>
+        <w:t>-</w:t>
+      </w:r>
+      <w:r>
+        <w:rPr>
+          <w:rFonts w:ascii="Calibri" w:hAnsi="Calibri" w:cs="Calibri"/>
+          <w:sz w:val="24"/>
+          <w:szCs w:val="24"/>
+        </w:rPr>
+        <w:t>based (affiliate) campaign type</w:t>
       </w:r>
     </w:p>
     <w:p>
@@ -17718,7 +18058,7 @@
           <w:sz w:val="24"/>
           <w:szCs w:val="24"/>
         </w:rPr>
-        <w:t>Performance</w:t>
+        <w:t>Agency multi</w:t>
       </w:r>
       <w:r>
         <w:rPr>
@@ -17734,7 +18074,7 @@
           <w:sz w:val="24"/>
           <w:szCs w:val="24"/>
         </w:rPr>
-        <w:t>based (affiliate) campaign type</w:t>
+        <w:t>brand dashboard</w:t>
       </w:r>
     </w:p>
     <w:p>
@@ -17757,23 +18097,7 @@
           <w:sz w:val="24"/>
           <w:szCs w:val="24"/>
         </w:rPr>
-        <w:t>Agency multi</w:t>
-      </w:r>
-      <w:r>
-        <w:rPr>
-          <w:rFonts w:ascii="Calibri" w:hAnsi="Calibri" w:cs="Calibri"/>
-          <w:sz w:val="24"/>
-          <w:szCs w:val="24"/>
-        </w:rPr>
-        <w:t>-</w:t>
-      </w:r>
-      <w:r>
-        <w:rPr>
-          <w:rFonts w:ascii="Calibri" w:hAnsi="Calibri" w:cs="Calibri"/>
-          <w:sz w:val="24"/>
-          <w:szCs w:val="24"/>
-        </w:rPr>
-        <w:t>brand dashboard</w:t>
+        <w:t>Advanced campaign analytics (reach, conversions, ROI)</w:t>
       </w:r>
     </w:p>
     <w:p>
@@ -17796,7 +18120,7 @@
           <w:sz w:val="24"/>
           <w:szCs w:val="24"/>
         </w:rPr>
-        <w:t>Advanced campaign analytics (reach, conversions, ROI)</w:t>
+        <w:t>Gamification: Insta Awards, leaderboards, achievement badges</w:t>
       </w:r>
     </w:p>
     <w:p>
@@ -17819,30 +18143,7 @@
           <w:sz w:val="24"/>
           <w:szCs w:val="24"/>
         </w:rPr>
-        <w:t>Gamification: Insta Awards, leaderboards, achievement badges</w:t>
-      </w:r>
-    </w:p>
-    <w:p>
-      <w:pPr>
-        <w:pStyle w:val="ListParagraph"/>
-        <w:numPr>
-          <w:ilvl w:val="0"/>
-          <w:numId w:val="2"/>
-        </w:numPr>
-        <w:spacing w:before="40" w:after="40"/>
-        <w:rPr>
-          <w:rFonts w:ascii="Calibri" w:hAnsi="Calibri" w:cs="Calibri"/>
-          <w:sz w:val="24"/>
-          <w:szCs w:val="24"/>
-        </w:rPr>
-      </w:pPr>
-      <w:r>
-        <w:rPr>
-          <w:rFonts w:ascii="Calibri" w:hAnsi="Calibri" w:cs="Calibri"/>
-          <w:sz w:val="24"/>
-          <w:szCs w:val="24"/>
-        </w:rPr>
-        <w:t>[DIFFERENTIATOR?] In</w:t>
+        <w:t>In</w:t>
       </w:r>
       <w:r>
         <w:rPr>
@@ -19256,39 +19557,7 @@
           <w:sz w:val="24"/>
           <w:szCs w:val="24"/>
         </w:rPr>
-        <w:t xml:space="preserve">What </w:t>
-      </w:r>
-      <w:r>
-        <w:rPr>
-          <w:rFonts w:ascii="Calibri" w:hAnsi="Calibri" w:cs="Calibri"/>
-          <w:sz w:val="24"/>
-          <w:szCs w:val="24"/>
-        </w:rPr>
-        <w:t>is</w:t>
-      </w:r>
-      <w:r>
-        <w:rPr>
-          <w:rFonts w:ascii="Calibri" w:hAnsi="Calibri" w:cs="Calibri"/>
-          <w:sz w:val="24"/>
-          <w:szCs w:val="24"/>
-        </w:rPr>
-        <w:t xml:space="preserve"> the specific differentiation angle</w:t>
-      </w:r>
-      <w:r>
-        <w:rPr>
-          <w:rFonts w:ascii="Calibri" w:hAnsi="Calibri" w:cs="Calibri"/>
-          <w:sz w:val="24"/>
-          <w:szCs w:val="24"/>
-        </w:rPr>
-        <w:t xml:space="preserve"> we</w:t>
-      </w:r>
-      <w:r>
-        <w:rPr>
-          <w:rFonts w:ascii="Calibri" w:hAnsi="Calibri" w:cs="Calibri"/>
-          <w:sz w:val="24"/>
-          <w:szCs w:val="24"/>
-        </w:rPr>
-        <w:t xml:space="preserve"> want to lead with </w:t>
+        <w:t>What is the go</w:t>
       </w:r>
       <w:r>
         <w:rPr>
@@ -19304,7 +19573,7 @@
           <w:sz w:val="24"/>
           <w:szCs w:val="24"/>
         </w:rPr>
-        <w:t xml:space="preserve"> AI</w:t>
+        <w:t>to</w:t>
       </w:r>
       <w:r>
         <w:rPr>
@@ -19320,7 +19589,7 @@
           <w:sz w:val="24"/>
           <w:szCs w:val="24"/>
         </w:rPr>
-        <w:t>first? Regional</w:t>
+        <w:t xml:space="preserve">market strategy for brand acquisition </w:t>
       </w:r>
       <w:r>
         <w:rPr>
@@ -19336,7 +19605,7 @@
           <w:sz w:val="24"/>
           <w:szCs w:val="24"/>
         </w:rPr>
-        <w:t>first? YouTube</w:t>
+        <w:t xml:space="preserve"> outbound sales team, self</w:t>
       </w:r>
       <w:r>
         <w:rPr>
@@ -19352,31 +19621,31 @@
           <w:sz w:val="24"/>
           <w:szCs w:val="24"/>
         </w:rPr>
-        <w:t>first? Community</w:t>
-      </w:r>
-      <w:r>
-        <w:rPr>
-          <w:rFonts w:ascii="Calibri" w:hAnsi="Calibri" w:cs="Calibri"/>
-          <w:sz w:val="24"/>
-          <w:szCs w:val="24"/>
-        </w:rPr>
-        <w:t>-</w:t>
-      </w:r>
-      <w:r>
-        <w:rPr>
-          <w:rFonts w:ascii="Calibri" w:hAnsi="Calibri" w:cs="Calibri"/>
-          <w:sz w:val="24"/>
-          <w:szCs w:val="24"/>
-        </w:rPr>
-        <w:t>first?</w:t>
-      </w:r>
-      <w:r>
-        <w:rPr>
-          <w:rFonts w:ascii="Calibri" w:hAnsi="Calibri" w:cs="Calibri"/>
-          <w:sz w:val="24"/>
-          <w:szCs w:val="24"/>
-        </w:rPr>
-        <w:t xml:space="preserve"> – All of them in this sequence = AI first &gt; Regional first &gt; YT first &gt; Community first</w:t>
+        <w:t>serve, partnerships with D2C brands?</w:t>
+      </w:r>
+      <w:r>
+        <w:rPr>
+          <w:rFonts w:ascii="Calibri" w:hAnsi="Calibri" w:cs="Calibri"/>
+          <w:sz w:val="24"/>
+          <w:szCs w:val="24"/>
+        </w:rPr>
+        <w:t xml:space="preserve"> = Not yet decided</w:t>
+      </w:r>
+      <w:r>
+        <w:rPr>
+          <w:rFonts w:ascii="Calibri" w:hAnsi="Calibri" w:cs="Calibri"/>
+          <w:sz w:val="24"/>
+          <w:szCs w:val="24"/>
+        </w:rPr>
+        <w:t xml:space="preserve"> - </w:t>
+      </w:r>
+      <w:r>
+        <w:rPr>
+          <w:rFonts w:ascii="Calibri" w:hAnsi="Calibri" w:cs="Calibri"/>
+          <w:sz w:val="24"/>
+          <w:szCs w:val="24"/>
+        </w:rPr>
+        <w:t>let’s first build the MVP then we will go on those things</w:t>
       </w:r>
     </w:p>
     <w:p>
@@ -19398,7 +19667,7 @@
           <w:sz w:val="24"/>
           <w:szCs w:val="24"/>
         </w:rPr>
-        <w:t>Is the target geography India</w:t>
+        <w:t xml:space="preserve">What is the stance on barter vs paid collabs </w:t>
       </w:r>
       <w:r>
         <w:rPr>
@@ -19414,15 +19683,39 @@
           <w:sz w:val="24"/>
           <w:szCs w:val="24"/>
         </w:rPr>
-        <w:t>wide from Day 1 or starting with a specific city cluster (e.g., Mumbai/Delhi/Bangalore)?</w:t>
-      </w:r>
-      <w:r>
-        <w:rPr>
-          <w:rFonts w:ascii="Calibri" w:hAnsi="Calibri" w:cs="Calibri"/>
-          <w:sz w:val="24"/>
-          <w:szCs w:val="24"/>
-        </w:rPr>
-        <w:t xml:space="preserve"> = India wide</w:t>
+        <w:t xml:space="preserve"> should barter be free</w:t>
+      </w:r>
+      <w:r>
+        <w:rPr>
+          <w:rFonts w:ascii="Calibri" w:hAnsi="Calibri" w:cs="Calibri"/>
+          <w:sz w:val="24"/>
+          <w:szCs w:val="24"/>
+        </w:rPr>
+        <w:t>-</w:t>
+      </w:r>
+      <w:r>
+        <w:rPr>
+          <w:rFonts w:ascii="Calibri" w:hAnsi="Calibri" w:cs="Calibri"/>
+          <w:sz w:val="24"/>
+          <w:szCs w:val="24"/>
+        </w:rPr>
+        <w:t>tier accessible, or Collab Pass only?</w:t>
+      </w:r>
+      <w:r>
+        <w:rPr>
+          <w:rFonts w:ascii="Calibri" w:hAnsi="Calibri" w:cs="Calibri"/>
+          <w:sz w:val="24"/>
+          <w:szCs w:val="24"/>
+        </w:rPr>
+        <w:t xml:space="preserve"> = Not yet decided</w:t>
+      </w:r>
+      <w:r>
+        <w:rPr>
+          <w:rFonts w:ascii="Calibri" w:hAnsi="Calibri" w:cs="Calibri"/>
+          <w:sz w:val="24"/>
+          <w:szCs w:val="24"/>
+        </w:rPr>
+        <w:t xml:space="preserve"> – let’s first build the MVP then we will go on those things</w:t>
       </w:r>
     </w:p>
     <w:p>
@@ -19444,403 +19737,25 @@
           <w:sz w:val="24"/>
           <w:szCs w:val="24"/>
         </w:rPr>
-        <w:t xml:space="preserve">What is the initial funding situation </w:t>
-      </w:r>
-      <w:r>
-        <w:rPr>
-          <w:rFonts w:ascii="Calibri" w:hAnsi="Calibri" w:cs="Calibri"/>
-          <w:sz w:val="24"/>
-          <w:szCs w:val="24"/>
-        </w:rPr>
-        <w:t>-</w:t>
-      </w:r>
-      <w:r>
-        <w:rPr>
-          <w:rFonts w:ascii="Calibri" w:hAnsi="Calibri" w:cs="Calibri"/>
-          <w:sz w:val="24"/>
-          <w:szCs w:val="24"/>
-        </w:rPr>
-        <w:t xml:space="preserve"> bootstrapped or funded? This significantly affects Phase 1 scope.</w:t>
-      </w:r>
-      <w:r>
-        <w:rPr>
-          <w:rFonts w:ascii="Calibri" w:hAnsi="Calibri" w:cs="Calibri"/>
-          <w:sz w:val="24"/>
-          <w:szCs w:val="24"/>
-        </w:rPr>
-        <w:t xml:space="preserve"> = bootstrapped</w:t>
-      </w:r>
-    </w:p>
-    <w:p>
-      <w:pPr>
-        <w:pStyle w:val="ListParagraph"/>
-        <w:numPr>
-          <w:ilvl w:val="0"/>
-          <w:numId w:val="3"/>
-        </w:numPr>
-        <w:rPr>
-          <w:rFonts w:ascii="Calibri" w:hAnsi="Calibri" w:cs="Calibri"/>
-          <w:sz w:val="24"/>
-          <w:szCs w:val="24"/>
-        </w:rPr>
-      </w:pPr>
-      <w:r>
-        <w:rPr>
-          <w:rFonts w:ascii="Calibri" w:hAnsi="Calibri" w:cs="Calibri"/>
-          <w:sz w:val="24"/>
-          <w:szCs w:val="24"/>
-        </w:rPr>
-        <w:t>Does the platform want to include YouTube/Twitter/LinkedIn influencers in Phase 1, or Instagram</w:t>
-      </w:r>
-      <w:r>
-        <w:rPr>
-          <w:rFonts w:ascii="Calibri" w:hAnsi="Calibri" w:cs="Calibri"/>
-          <w:sz w:val="24"/>
-          <w:szCs w:val="24"/>
-        </w:rPr>
-        <w:t>-</w:t>
-      </w:r>
-      <w:r>
-        <w:rPr>
-          <w:rFonts w:ascii="Calibri" w:hAnsi="Calibri" w:cs="Calibri"/>
-          <w:sz w:val="24"/>
-          <w:szCs w:val="24"/>
-        </w:rPr>
-        <w:t>only like Influish MVP?</w:t>
-      </w:r>
-      <w:r>
-        <w:rPr>
-          <w:rFonts w:ascii="Calibri" w:hAnsi="Calibri" w:cs="Calibri"/>
-          <w:sz w:val="24"/>
-          <w:szCs w:val="24"/>
-        </w:rPr>
-        <w:t xml:space="preserve"> = Instagram and YT in Phase 1</w:t>
-      </w:r>
-    </w:p>
-    <w:p>
-      <w:pPr>
-        <w:pStyle w:val="ListParagraph"/>
-        <w:numPr>
-          <w:ilvl w:val="0"/>
-          <w:numId w:val="3"/>
-        </w:numPr>
-        <w:rPr>
-          <w:rFonts w:ascii="Calibri" w:hAnsi="Calibri" w:cs="Calibri"/>
-          <w:sz w:val="24"/>
-          <w:szCs w:val="24"/>
-        </w:rPr>
-      </w:pPr>
-      <w:r>
-        <w:rPr>
-          <w:rFonts w:ascii="Calibri" w:hAnsi="Calibri" w:cs="Calibri"/>
-          <w:sz w:val="24"/>
-          <w:szCs w:val="24"/>
-        </w:rPr>
-        <w:t>What is the go</w:t>
-      </w:r>
-      <w:r>
-        <w:rPr>
-          <w:rFonts w:ascii="Calibri" w:hAnsi="Calibri" w:cs="Calibri"/>
-          <w:sz w:val="24"/>
-          <w:szCs w:val="24"/>
-        </w:rPr>
-        <w:t>-</w:t>
-      </w:r>
-      <w:r>
-        <w:rPr>
-          <w:rFonts w:ascii="Calibri" w:hAnsi="Calibri" w:cs="Calibri"/>
-          <w:sz w:val="24"/>
-          <w:szCs w:val="24"/>
-        </w:rPr>
-        <w:t>to</w:t>
-      </w:r>
-      <w:r>
-        <w:rPr>
-          <w:rFonts w:ascii="Calibri" w:hAnsi="Calibri" w:cs="Calibri"/>
-          <w:sz w:val="24"/>
-          <w:szCs w:val="24"/>
-        </w:rPr>
-        <w:t>-</w:t>
-      </w:r>
-      <w:r>
-        <w:rPr>
-          <w:rFonts w:ascii="Calibri" w:hAnsi="Calibri" w:cs="Calibri"/>
-          <w:sz w:val="24"/>
-          <w:szCs w:val="24"/>
-        </w:rPr>
-        <w:t xml:space="preserve">market strategy for brand acquisition </w:t>
-      </w:r>
-      <w:r>
-        <w:rPr>
-          <w:rFonts w:ascii="Calibri" w:hAnsi="Calibri" w:cs="Calibri"/>
-          <w:sz w:val="24"/>
-          <w:szCs w:val="24"/>
-        </w:rPr>
-        <w:t>-</w:t>
-      </w:r>
-      <w:r>
-        <w:rPr>
-          <w:rFonts w:ascii="Calibri" w:hAnsi="Calibri" w:cs="Calibri"/>
-          <w:sz w:val="24"/>
-          <w:szCs w:val="24"/>
-        </w:rPr>
-        <w:t xml:space="preserve"> outbound sales team, self</w:t>
-      </w:r>
-      <w:r>
-        <w:rPr>
-          <w:rFonts w:ascii="Calibri" w:hAnsi="Calibri" w:cs="Calibri"/>
-          <w:sz w:val="24"/>
-          <w:szCs w:val="24"/>
-        </w:rPr>
-        <w:t>-</w:t>
-      </w:r>
-      <w:r>
-        <w:rPr>
-          <w:rFonts w:ascii="Calibri" w:hAnsi="Calibri" w:cs="Calibri"/>
-          <w:sz w:val="24"/>
-          <w:szCs w:val="24"/>
-        </w:rPr>
-        <w:t>serve, partnerships with D2C brands?</w:t>
-      </w:r>
-      <w:r>
-        <w:rPr>
-          <w:rFonts w:ascii="Calibri" w:hAnsi="Calibri" w:cs="Calibri"/>
-          <w:sz w:val="24"/>
-          <w:szCs w:val="24"/>
-        </w:rPr>
-        <w:t xml:space="preserve"> = Not yet decided</w:t>
-      </w:r>
-      <w:r>
-        <w:rPr>
-          <w:rFonts w:ascii="Calibri" w:hAnsi="Calibri" w:cs="Calibri"/>
-          <w:sz w:val="24"/>
-          <w:szCs w:val="24"/>
-        </w:rPr>
-        <w:t xml:space="preserve"> - </w:t>
-      </w:r>
-      <w:r>
-        <w:rPr>
-          <w:rFonts w:ascii="Calibri" w:hAnsi="Calibri" w:cs="Calibri"/>
-          <w:sz w:val="24"/>
-          <w:szCs w:val="24"/>
-        </w:rPr>
-        <w:t>let’s first build the MVP then we will go on those things</w:t>
-      </w:r>
-    </w:p>
-    <w:p>
-      <w:pPr>
-        <w:pStyle w:val="ListParagraph"/>
-        <w:numPr>
-          <w:ilvl w:val="0"/>
-          <w:numId w:val="3"/>
-        </w:numPr>
-        <w:rPr>
-          <w:rFonts w:ascii="Calibri" w:hAnsi="Calibri" w:cs="Calibri"/>
-          <w:sz w:val="24"/>
-          <w:szCs w:val="24"/>
-        </w:rPr>
-      </w:pPr>
-      <w:r>
-        <w:rPr>
-          <w:rFonts w:ascii="Calibri" w:hAnsi="Calibri" w:cs="Calibri"/>
-          <w:sz w:val="24"/>
-          <w:szCs w:val="24"/>
-        </w:rPr>
-        <w:t>Should the platform have a web</w:t>
-      </w:r>
-      <w:r>
-        <w:rPr>
-          <w:rFonts w:ascii="Calibri" w:hAnsi="Calibri" w:cs="Calibri"/>
-          <w:sz w:val="24"/>
-          <w:szCs w:val="24"/>
-        </w:rPr>
-        <w:t>-</w:t>
-      </w:r>
-      <w:r>
-        <w:rPr>
-          <w:rFonts w:ascii="Calibri" w:hAnsi="Calibri" w:cs="Calibri"/>
-          <w:sz w:val="24"/>
-          <w:szCs w:val="24"/>
-        </w:rPr>
-        <w:t>first brand dashboard from Day 1 (potential differentiator vs Influish which is app</w:t>
-      </w:r>
-      <w:r>
-        <w:rPr>
-          <w:rFonts w:ascii="Calibri" w:hAnsi="Calibri" w:cs="Calibri"/>
-          <w:sz w:val="24"/>
-          <w:szCs w:val="24"/>
-        </w:rPr>
-        <w:t>-</w:t>
-      </w:r>
-      <w:r>
-        <w:rPr>
-          <w:rFonts w:ascii="Calibri" w:hAnsi="Calibri" w:cs="Calibri"/>
-          <w:sz w:val="24"/>
-          <w:szCs w:val="24"/>
-        </w:rPr>
-        <w:t>only)?</w:t>
-      </w:r>
-      <w:r>
-        <w:rPr>
-          <w:rFonts w:ascii="Calibri" w:hAnsi="Calibri" w:cs="Calibri"/>
-          <w:sz w:val="24"/>
-          <w:szCs w:val="24"/>
-        </w:rPr>
-        <w:t xml:space="preserve"> = I want </w:t>
-      </w:r>
-      <w:r>
-        <w:rPr>
-          <w:rFonts w:ascii="Calibri" w:hAnsi="Calibri" w:cs="Calibri"/>
-          <w:sz w:val="24"/>
-          <w:szCs w:val="24"/>
-        </w:rPr>
-        <w:t>both,</w:t>
-      </w:r>
-      <w:r>
-        <w:rPr>
-          <w:rFonts w:ascii="Calibri" w:hAnsi="Calibri" w:cs="Calibri"/>
-          <w:sz w:val="24"/>
-          <w:szCs w:val="24"/>
-        </w:rPr>
-        <w:t xml:space="preserve"> but App will have more priority of releases than web</w:t>
-      </w:r>
-    </w:p>
-    <w:p>
-      <w:pPr>
-        <w:pStyle w:val="ListParagraph"/>
-        <w:numPr>
-          <w:ilvl w:val="0"/>
-          <w:numId w:val="3"/>
-        </w:numPr>
-        <w:rPr>
-          <w:rFonts w:ascii="Calibri" w:hAnsi="Calibri" w:cs="Calibri"/>
-          <w:sz w:val="24"/>
-          <w:szCs w:val="24"/>
-        </w:rPr>
-      </w:pPr>
-      <w:r>
-        <w:rPr>
-          <w:rFonts w:ascii="Calibri" w:hAnsi="Calibri" w:cs="Calibri"/>
-          <w:sz w:val="24"/>
-          <w:szCs w:val="24"/>
-        </w:rPr>
-        <w:t xml:space="preserve">Is there an agency play </w:t>
-      </w:r>
-      <w:r>
-        <w:rPr>
-          <w:rFonts w:ascii="Calibri" w:hAnsi="Calibri" w:cs="Calibri"/>
-          <w:sz w:val="24"/>
-          <w:szCs w:val="24"/>
-        </w:rPr>
-        <w:t>-</w:t>
-      </w:r>
-      <w:r>
-        <w:rPr>
-          <w:rFonts w:ascii="Calibri" w:hAnsi="Calibri" w:cs="Calibri"/>
-          <w:sz w:val="24"/>
-          <w:szCs w:val="24"/>
-        </w:rPr>
-        <w:t xml:space="preserve"> building tools for influencer management agencies, not just direct brands?</w:t>
-      </w:r>
-      <w:r>
-        <w:rPr>
-          <w:rFonts w:ascii="Calibri" w:hAnsi="Calibri" w:cs="Calibri"/>
-          <w:sz w:val="24"/>
-          <w:szCs w:val="24"/>
-        </w:rPr>
-        <w:t xml:space="preserve"> = Yes</w:t>
-      </w:r>
-    </w:p>
-    <w:p>
-      <w:pPr>
-        <w:pStyle w:val="ListParagraph"/>
-        <w:numPr>
-          <w:ilvl w:val="0"/>
-          <w:numId w:val="3"/>
-        </w:numPr>
-        <w:rPr>
-          <w:rFonts w:ascii="Calibri" w:hAnsi="Calibri" w:cs="Calibri"/>
-          <w:sz w:val="24"/>
-          <w:szCs w:val="24"/>
-        </w:rPr>
-      </w:pPr>
-      <w:r>
-        <w:rPr>
-          <w:rFonts w:ascii="Calibri" w:hAnsi="Calibri" w:cs="Calibri"/>
-          <w:sz w:val="24"/>
-          <w:szCs w:val="24"/>
-        </w:rPr>
-        <w:t xml:space="preserve">What is the stance on barter vs paid collabs </w:t>
-      </w:r>
-      <w:r>
-        <w:rPr>
-          <w:rFonts w:ascii="Calibri" w:hAnsi="Calibri" w:cs="Calibri"/>
-          <w:sz w:val="24"/>
-          <w:szCs w:val="24"/>
-        </w:rPr>
-        <w:t>-</w:t>
-      </w:r>
-      <w:r>
-        <w:rPr>
-          <w:rFonts w:ascii="Calibri" w:hAnsi="Calibri" w:cs="Calibri"/>
-          <w:sz w:val="24"/>
-          <w:szCs w:val="24"/>
-        </w:rPr>
-        <w:t xml:space="preserve"> should barter be free</w:t>
-      </w:r>
-      <w:r>
-        <w:rPr>
-          <w:rFonts w:ascii="Calibri" w:hAnsi="Calibri" w:cs="Calibri"/>
-          <w:sz w:val="24"/>
-          <w:szCs w:val="24"/>
-        </w:rPr>
-        <w:t>-</w:t>
-      </w:r>
-      <w:r>
-        <w:rPr>
-          <w:rFonts w:ascii="Calibri" w:hAnsi="Calibri" w:cs="Calibri"/>
-          <w:sz w:val="24"/>
-          <w:szCs w:val="24"/>
-        </w:rPr>
-        <w:t>tier accessible, or Collab Pass only?</w:t>
-      </w:r>
-      <w:r>
-        <w:rPr>
-          <w:rFonts w:ascii="Calibri" w:hAnsi="Calibri" w:cs="Calibri"/>
-          <w:sz w:val="24"/>
-          <w:szCs w:val="24"/>
-        </w:rPr>
-        <w:t xml:space="preserve"> = Not yet decided</w:t>
-      </w:r>
-      <w:r>
-        <w:rPr>
-          <w:rFonts w:ascii="Calibri" w:hAnsi="Calibri" w:cs="Calibri"/>
-          <w:sz w:val="24"/>
-          <w:szCs w:val="24"/>
-        </w:rPr>
-        <w:t xml:space="preserve"> – let’s first build the MVP then we will go on those things</w:t>
-      </w:r>
-    </w:p>
-    <w:p>
-      <w:pPr>
-        <w:pStyle w:val="ListParagraph"/>
-        <w:numPr>
-          <w:ilvl w:val="0"/>
-          <w:numId w:val="3"/>
-        </w:numPr>
-        <w:rPr>
-          <w:rFonts w:ascii="Calibri" w:hAnsi="Calibri" w:cs="Calibri"/>
-          <w:sz w:val="24"/>
-          <w:szCs w:val="24"/>
-        </w:rPr>
-      </w:pPr>
-      <w:r>
-        <w:rPr>
-          <w:rFonts w:ascii="Calibri" w:hAnsi="Calibri" w:cs="Calibri"/>
-          <w:sz w:val="24"/>
-          <w:szCs w:val="24"/>
-        </w:rPr>
-        <w:t xml:space="preserve">Brand identity (visual system, logo) and domain availability check for Cravio </w:t>
+        <w:t xml:space="preserve">Brand identity (visual system, logo) and domain availability check for </w:t>
+      </w:r>
+      <w:proofErr w:type="spellStart"/>
+      <w:r>
+        <w:rPr>
+          <w:rFonts w:ascii="Calibri" w:hAnsi="Calibri" w:cs="Calibri"/>
+          <w:sz w:val="24"/>
+          <w:szCs w:val="24"/>
+        </w:rPr>
+        <w:t>Cravio</w:t>
+      </w:r>
+      <w:proofErr w:type="spellEnd"/>
+      <w:r>
+        <w:rPr>
+          <w:rFonts w:ascii="Calibri" w:hAnsi="Calibri" w:cs="Calibri"/>
+          <w:sz w:val="24"/>
+          <w:szCs w:val="24"/>
+        </w:rPr>
+        <w:t xml:space="preserve"> </w:t>
       </w:r>
       <w:r>
         <w:rPr>

</xml_diff>